<commit_message>
Tidy project structure and policy config
</commit_message>
<xml_diff>
--- a/OpenClaw_multi_agent_finance_report.docx
+++ b/OpenClaw_multi_agent_finance_report.docx
@@ -217,7 +217,7 @@
           </w:tcPr>
           <w:p>
             <w:r>
-              <w:t>系统运行后自动生成的报告</w:t>
+              <w:t>系统运行后自动生成的报告，本地生成，不作为固定源码提交</w:t>
             </w:r>
           </w:p>
         </w:tc>
@@ -488,7 +488,7 @@
     <w:p/>
     <w:p>
       <w:r>
-        <w:t>交易信号会写入 reports/latest_signal.json。信号格式受 schemas/trade_signal.schema.json 约束，主要包含标的、周期、建议动作、置信度、理由、指标快照、订单草稿、风险参数和是否需要人工审批。这样做的好处是后续模块不需要从一段自由文本中猜测含义，可以直接读取结构化字段。</w:t>
+        <w:t>交易信号会写入 reports/latest_signal.json。信号格式受 schemas/trade_signal.schema.json 约束，主要包含标的、周期、建议动作、置信度、理由、指标快照、订单草稿、风险参数和是否需要人工审批。策略阈值、风控阈值和仓位参数集中放在 config/trading_policy.json 中，避免在多个函数里分散硬编码。这样做的好处是后续模块不需要从一段自由文本中猜测含义，也方便后续替换为回测调参结果。</w:t>
       </w:r>
     </w:p>
     <w:p/>
@@ -1453,7 +1453,7 @@
     <w:p/>
     <w:p>
       <w:r>
-        <w:t>第四，回测部分还比较简化。当前回测可以展示初始资金、最终权益、收益率、最大回撤和交易次数，但还没有加入手续费、滑点、停牌、流动性约束等真实交易成本，也没有和买入持有、传统多因子策略做完整横向对比。</w:t>
+        <w:t>第四，回测部分还比较简化。当前回测可以展示初始资金、最终权益、收益率、最大回撤和交易次数，但还没有加入手续费、滑点、停牌、流动性约束等真实交易成本，也没有和买入持有、传统多因子策略做完整横向对比。现有阈值应理解为原型配置，而不是已经经过充分调参的生产参数。</w:t>
       </w:r>
     </w:p>
     <w:p/>

</xml_diff>

<commit_message>
Fix bullet rendering and update test count in reports
</commit_message>
<xml_diff>
--- a/OpenClaw_multi_agent_finance_report.docx
+++ b/OpenClaw_multi_agent_finance_report.docx
@@ -434,7 +434,7 @@
         <w:pStyle w:val="ListParagraph"/>
       </w:pPr>
       <w:r>
-        <w:t>? RSI14</w:t>
+        <w:t>• RSI14</w:t>
       </w:r>
     </w:p>
     <w:p>
@@ -442,7 +442,7 @@
         <w:pStyle w:val="ListParagraph"/>
       </w:pPr>
       <w:r>
-        <w:t>? MACD 和 MACD histogram</w:t>
+        <w:t>• MACD 和 MACD histogram</w:t>
       </w:r>
     </w:p>
     <w:p>
@@ -450,7 +450,7 @@
         <w:pStyle w:val="ListParagraph"/>
       </w:pPr>
       <w:r>
-        <w:t>? MA20、MA50</w:t>
+        <w:t>• MA20、MA50</w:t>
       </w:r>
     </w:p>
     <w:p>
@@ -458,7 +458,7 @@
         <w:pStyle w:val="ListParagraph"/>
       </w:pPr>
       <w:r>
-        <w:t>? 1 日收益率和 5 日收益率</w:t>
+        <w:t>• 1 日收益率和 5 日收益率</w:t>
       </w:r>
     </w:p>
     <w:p>
@@ -466,7 +466,7 @@
         <w:pStyle w:val="ListParagraph"/>
       </w:pPr>
       <w:r>
-        <w:t>? 20 日年化波动率</w:t>
+        <w:t>• 20 日年化波动率</w:t>
       </w:r>
     </w:p>
     <w:p>
@@ -474,7 +474,7 @@
         <w:pStyle w:val="ListParagraph"/>
       </w:pPr>
       <w:r>
-        <w:t>? 60 日最大回撤</w:t>
+        <w:t>• 60 日最大回撤</w:t>
       </w:r>
     </w:p>
     <w:p>
@@ -482,7 +482,7 @@
         <w:pStyle w:val="ListParagraph"/>
       </w:pPr>
       <w:r>
-        <w:t>? VaR95 和 CVaR95</w:t>
+        <w:t>• VaR95 和 CVaR95</w:t>
       </w:r>
     </w:p>
     <w:p/>
@@ -557,7 +557,7 @@
         <w:pStyle w:val="ListParagraph"/>
       </w:pPr>
       <w:r>
-        <w:t>? 仓位暴露是否超过上限；</w:t>
+        <w:t>• 仓位暴露是否超过上限；</w:t>
       </w:r>
     </w:p>
     <w:p>
@@ -565,7 +565,7 @@
         <w:pStyle w:val="ListParagraph"/>
       </w:pPr>
       <w:r>
-        <w:t>? VaR95 是否超过阈值；</w:t>
+        <w:t>• VaR95 是否超过阈值；</w:t>
       </w:r>
     </w:p>
     <w:p>
@@ -573,7 +573,7 @@
         <w:pStyle w:val="ListParagraph"/>
       </w:pPr>
       <w:r>
-        <w:t>? CVaR95 是否超过阈值；</w:t>
+        <w:t>• CVaR95 是否超过阈值；</w:t>
       </w:r>
     </w:p>
     <w:p>
@@ -581,7 +581,7 @@
         <w:pStyle w:val="ListParagraph"/>
       </w:pPr>
       <w:r>
-        <w:t>? 60 日最大回撤是否超过阈值；</w:t>
+        <w:t>• 60 日最大回撤是否超过阈值；</w:t>
       </w:r>
     </w:p>
     <w:p>
@@ -589,7 +589,7 @@
         <w:pStyle w:val="ListParagraph"/>
       </w:pPr>
       <w:r>
-        <w:t>? 交易信号是否符合 Schema；</w:t>
+        <w:t>• 交易信号是否符合 Schema；</w:t>
       </w:r>
     </w:p>
     <w:p>
@@ -597,7 +597,7 @@
         <w:pStyle w:val="ListParagraph"/>
       </w:pPr>
       <w:r>
-        <w:t>? 非 HOLD 信号是否需要人工审批。</w:t>
+        <w:t>• 非 HOLD 信号是否需要人工审批。</w:t>
       </w:r>
     </w:p>
     <w:p/>
@@ -702,7 +702,7 @@
         <w:pStyle w:val="Code"/>
       </w:pPr>
       <w:r>
-        <w:t>Ran 3 tests</w:t>
+        <w:t>Ran 4 tests</w:t>
       </w:r>
     </w:p>
     <w:p>

</xml_diff>